<commit_message>
docs: corrigir divergências entre artigo e implementação
No artigo: alto contraste, compatibilidade com Expo SDK 58, dados
salvos localmente, papel da API Go, referência de requisito e faixa
RF01-RF09. No README: nome completo da Giulia e versões dos
dispositivos de teste conforme o artigo.
</commit_message>
<xml_diff>
--- a/docs/documents/ArtigoCientifico_PharmaCode_v2.docx
+++ b/docs/documents/ArtigoCientifico_PharmaCode_v2.docx
@@ -3042,7 +3042,7 @@
                 <w:sz w:val="20"/>
                 <w:szCs w:val="20"/>
               </w:rPr>
-              <w:t xml:space="preserve">O sistema deverá oferecer opção de exibição em modo de alto contraste (fundo escuro / texto claro), ativável e desativável pelo usuário a qualquer momento.</w:t>
+              <w:t xml:space="preserve">O sistema deverá oferecer opção de exibição em modo de alto contraste (texto preto, cores mais escuras e bordas reforçadas), ativável e desativável pelo usuário a qualquer momento.</w:t>
             </w:r>
           </w:p>
         </w:tc>
@@ -3586,7 +3586,7 @@
                 <w:sz w:val="20"/>
                 <w:szCs w:val="20"/>
               </w:rPr>
-              <w:t xml:space="preserve">A aplicação deverá funcionar em dispositivos Android 10 ou superior e iOS 14 ou superior, cobrindo os modelos utilizados nos testes (Samsung Galaxy A54, iPhone 11 e iPhone 13).</w:t>
+              <w:t xml:space="preserve">A aplicação deverá funcionar em dispositivos Android e iOS compatíveis com o Expo SDK 58, cobrindo os modelos utilizados nos testes (Samsung Galaxy A54 com Android 13, iPhone 11 e iPhone 13 com iOS 17).</w:t>
             </w:r>
           </w:p>
         </w:tc>
@@ -4834,7 +4834,7 @@
           <w:sz w:val="24"/>
           <w:szCs w:val="24"/>
         </w:rPr>
-        <w:t xml:space="preserve">AsyncStorage é utilizado para persistência local das preferências de acessibilidade (tamanho de fonte, contraste, ativação de TTS) e do perfil de saúde do usuário (contraindicações cadastradas). Não há banco de dados local para bulas; o catálogo é consultado remotamente via API.</w:t>
+        <w:t xml:space="preserve">AsyncStorage é utilizado para persistência local das preferências de acessibilidade (tamanho de fonte, alto contraste e volume do áudio) e do perfil de saúde do usuário (condições de saúde e alergias cadastradas). Não há banco de dados local para bulas; o catálogo é consultado remotamente via API.</w:t>
       </w:r>
     </w:p>
     <w:p>
@@ -5417,7 +5417,7 @@
                 <w:sz w:val="20"/>
                 <w:szCs w:val="20"/>
               </w:rPr>
-              <w:t xml:space="preserve">Tipografia projetada especificamente para usuários com baixa visão (RNF03), com formas de caracteres diferenciadas para reduzir confusões de leitura; integrada via expo-font.</w:t>
+              <w:t xml:space="preserve">Tipografia projetada especificamente para usuários com baixa visão (RNF04), com formas de caracteres diferenciadas para reduzir confusões de leitura; integrada via expo-font.</w:t>
             </w:r>
           </w:p>
         </w:tc>
@@ -5469,7 +5469,7 @@
                 <w:sz w:val="20"/>
                 <w:szCs w:val="20"/>
               </w:rPr>
-              <w:t xml:space="preserve">Linguagem de alto desempenho para o servidor de API REST utilizado pela equipe no painel administrativo de curadoria das bulas. Não é acessado diretamente pelo usuário final.</w:t>
+              <w:t xml:space="preserve">Linguagem de alto desempenho para o servidor da API REST consultada pelo aplicativo (GET /drugs/ean/{ean}) e pelo painel administrativo de curadoria das bulas. O usuário final acessa o servidor apenas indiretamente, por meio do aplicativo.</w:t>
             </w:r>
           </w:p>
         </w:tc>
@@ -5747,7 +5747,7 @@
           <w:sz w:val="24"/>
           <w:szCs w:val="24"/>
         </w:rPr>
-        <w:t xml:space="preserve">Android 10 ou superior e iOS 14 ou superior.</w:t>
+        <w:t xml:space="preserve">Android e iOS, em dispositivos compatíveis com o Expo SDK 58 (testado em Samsung Galaxy A54, iPhone 11 e iPhone 13).</w:t>
       </w:r>
     </w:p>
     <w:p>
@@ -6169,7 +6169,7 @@
           <w:sz w:val="24"/>
           <w:szCs w:val="24"/>
         </w:rPr>
-        <w:t xml:space="preserve">verificação de todos os requisitos funcionais (RF01 a RF08), com casos de teste documentados para cada funcionalidade. Critério de aprovação: todas as funcionalidades executadas corretamente nos dispositivos de teste (Samsung Galaxy A54, iPhone 11 e iPhone 13).</w:t>
+        <w:t xml:space="preserve">verificação de todos os requisitos funcionais (RF01 a RF09), com casos de teste documentados para cada funcionalidade. Critério de aprovação: todas as funcionalidades executadas corretamente nos dispositivos de teste (Samsung Galaxy A54, iPhone 11 e iPhone 13).</w:t>
       </w:r>
     </w:p>
     <w:p>
@@ -6574,8 +6574,6 @@
             </a:graphic>
           </wp:inline>
         </w:drawing>
-      </w:r>
-      <w:r>
         <w:drawing>
           <wp:inline distT="0" distB="0" distL="0" distR="0">
             <wp:extent cx="1076325" cy="1905000"/>
@@ -6614,8 +6612,6 @@
             </a:graphic>
           </wp:inline>
         </w:drawing>
-      </w:r>
-      <w:r>
         <w:drawing>
           <wp:inline distT="0" distB="0" distL="0" distR="0">
             <wp:extent cx="1076325" cy="1905000"/>
@@ -6654,8 +6650,6 @@
             </a:graphic>
           </wp:inline>
         </w:drawing>
-      </w:r>
-      <w:r>
         <w:drawing>
           <wp:inline distT="0" distB="0" distL="0" distR="0">
             <wp:extent cx="1076325" cy="1905000"/>
@@ -6694,8 +6688,6 @@
             </a:graphic>
           </wp:inline>
         </w:drawing>
-      </w:r>
-      <w:r>
         <w:drawing>
           <wp:inline distT="0" distB="0" distL="0" distR="0">
             <wp:extent cx="1076325" cy="1905000"/>

</xml_diff>